<commit_message>
Move Tree's In Redevelopment status onto its own gray line
Co-Authored-By: Claude Fable 5 <noreply@anthropic.com>
Claude-Session: https://claude.ai/code/session_01APmxVZnXChYmuH8cBBMtxM
</commit_message>
<xml_diff>
--- a/resume/Ed Bermu — UX AI Product Designer Resume.docx
+++ b/resume/Ed Bermu — UX AI Product Designer Resume.docx
@@ -493,7 +493,7 @@
                           <wps:spPr>
                             <a:xfrm>
                               <a:off x="-97150" y="7402258"/>
-                              <a:ext cx="4577288" cy="1490000"/>
+                              <a:ext cx="4577288" cy="1515000"/>
                             </a:xfrm>
                             <a:prstGeom prst="rect">
                               <a:avLst/>
@@ -592,18 +592,6 @@
                                 <w:r>
                                   <w:fldChar w:fldCharType="end"/>
                                 </w:r>
-                                <w:r>
-                                  <w:rPr>
-                                    <w:rFonts w:ascii="Calibri" w:hAnsi="Calibri" w:cs="Calibri"/>
-                                  </w:rPr>
-                                  <w:t xml:space="preserve">  •  </w:t>
-                                </w:r>
-                                <w:r>
-                                  <w:rPr>
-                                    <w:rFonts w:ascii="Calibri" w:hAnsi="Calibri" w:cs="Calibri"/>
-                                  </w:rPr>
-                                  <w:t xml:space="preserve">In Redevelopment</w:t>
-                                </w:r>
                               </w:p>
                               <w:p>
                                 <w:pPr>
@@ -637,6 +625,8 @@
                                     <w:color w:val="A6A6A6" w:themeColor="background1" w:themeShade="A6"/>
                                   </w:rPr>
                                   <w:t xml:space="preserve">Google Certification Project, Nov 2020 - April 2021</w:t>
+                                  <w:br/>
+                                  <w:t xml:space="preserve">In Redevelopment</w:t>
                                 </w:r>
                               </w:p>
                               <w:p>
@@ -2474,7 +2464,7 @@
                       </w:txbxContent>
                     </v:textbox>
                   </v:shape>
-                  <v:shape id="Text Box 11" o:spid="_x0000_s1031" type="#_x0000_t202" style="position:absolute;left:-971;top:74022;width:45772;height:14900;visibility:visible;mso-wrap-style:square;v-text-anchor:top" o:gfxdata="UEsDBBQABgAIAAAAIQDb4fbL7gAAAIUBAAATAAAAW0NvbnRlbnRfVHlwZXNdLnhtbHyQz07DMAyH 70i8Q+QralM4IITa7kDhCAiNB7ASt43WOlEcyvb2pNu4IODoPz9/n1xv9vOkForiPDdwXVagiI23 jocG3rdPxR0oScgWJ8/UwIEENu3lRb09BBKV0ywNjCmFe63FjDSjlD4Q50nv44wpl3HQAc0OB9I3 VXWrjedEnIq03oC27qjHjympx31un0wiTQLq4bS4shrAECZnMGVTvbD9QSnOhDInjzsyuiBXWQP0 r4R18jfgnHvJr4nOknrFmJ5xzhraRtHWf3Kkpfz/yGo5S+H73hkquyhdjr3R8m2lj09svwAAAP// AwBQSwMEFAAGAAgAAAAhAFr0LFu/AAAAFQEAAAsAAABfcmVscy8ucmVsc2zPwWrDMAwG4Ptg72B0 X5TuUMaI01uh19I+gLGVxCy2jGSy9e1nemrHjpL4P0nD4SetZiPRyNnCruvBUPYcYp4tXC/Htw8w Wl0ObuVMFm6kcBhfX4Yzra62kC6xqGlKVgtLreUTUf1CyWnHhXKbTCzJ1VbKjMX5LzcTvvf9HuXR gPHJNKdgQU5hB+ZyK23zHztFL6w81c5zQp6m6P9TMfB3PtPWFCczVQtB9N4U2rp2HOA44NMz4y8A AAD//wMAUEsDBBQABgAIAAAAIQAGN+hHzQAAAOcAAAAPAAAAZHJzL2Rvd25yZXYueG1sRI9Ba8JA FITvQv/D8gredBPFNI2uUpRKiwcxLT0/ss9saPZtyG41/vtuQehlYBjmG2a1GWwrLtT7xrGCdJqA IK6cbrhW8PnxOslB+ICssXVMCm7kYbN+GK2w0O7KJ7qUoRYRwr5ABSaErpDSV4Ys+qnriGN2dr3F EG1fS93jNcJtK2dJkkmLDccFgx1tDVXf5Y9V8L5o99vsQPk5qUt5IH88fZmjUuPHYbeM8rIEEWgI /4074k0reE7n+eIpS1P4+xU/gVz/AgAA//8DAFBLAQItABQABgAIAAAAIQDb4fbL7gAAAIUBAAAT AAAAAAAAAAAAAAAAAAAAAABbQ29udGVudF9UeXBlc10ueG1sUEsBAi0AFAAGAAgAAAAhAFr0LFu/ AAAAFQEAAAsAAAAAAAAAAAAAAAAAHwEAAF9yZWxzLy5yZWxzUEsBAi0AFAAGAAgAAAAhAAY36EfN AAAA5wAAAA8AAAAAAAAAAAAAAAAABwIAAGRycy9kb3ducmV2LnhtbFBLBQYAAAAAAwADALcAAAAB AwAAAAA= " fillcolor="white [3201]" stroked="f" strokeweight=".25pt">
+                  <v:shape id="Text Box 11" o:spid="_x0000_s1031" type="#_x0000_t202" style="position:absolute;left:-971;top:74022;width:45772;height:15150;visibility:visible;mso-wrap-style:square;v-text-anchor:top" o:gfxdata="UEsDBBQABgAIAAAAIQDb4fbL7gAAAIUBAAATAAAAW0NvbnRlbnRfVHlwZXNdLnhtbHyQz07DMAyH 70i8Q+QralM4IITa7kDhCAiNB7ASt43WOlEcyvb2pNu4IODoPz9/n1xv9vOkForiPDdwXVagiI23 jocG3rdPxR0oScgWJ8/UwIEENu3lRb09BBKV0ywNjCmFe63FjDSjlD4Q50nv44wpl3HQAc0OB9I3 VXWrjedEnIq03oC27qjHjympx31un0wiTQLq4bS4shrAECZnMGVTvbD9QSnOhDInjzsyuiBXWQP0 r4R18jfgnHvJr4nOknrFmJ5xzhraRtHWf3Kkpfz/yGo5S+H73hkquyhdjr3R8m2lj09svwAAAP// AwBQSwMEFAAGAAgAAAAhAFr0LFu/AAAAFQEAAAsAAABfcmVscy8ucmVsc2zPwWrDMAwG4Ptg72B0 X5TuUMaI01uh19I+gLGVxCy2jGSy9e1nemrHjpL4P0nD4SetZiPRyNnCruvBUPYcYp4tXC/Htw8w Wl0ObuVMFm6kcBhfX4Yzra62kC6xqGlKVgtLreUTUf1CyWnHhXKbTCzJ1VbKjMX5LzcTvvf9HuXR gPHJNKdgQU5hB+ZyK23zHztFL6w81c5zQp6m6P9TMfB3PtPWFCczVQtB9N4U2rp2HOA44NMz4y8A AAD//wMAUEsDBBQABgAIAAAAIQAGN+hHzQAAAOcAAAAPAAAAZHJzL2Rvd25yZXYueG1sRI9Ba8JA FITvQv/D8gredBPFNI2uUpRKiwcxLT0/ss9saPZtyG41/vtuQehlYBjmG2a1GWwrLtT7xrGCdJqA IK6cbrhW8PnxOslB+ICssXVMCm7kYbN+GK2w0O7KJ7qUoRYRwr5ABSaErpDSV4Ys+qnriGN2dr3F EG1fS93jNcJtK2dJkkmLDccFgx1tDVXf5Y9V8L5o99vsQPk5qUt5IH88fZmjUuPHYbeM8rIEEWgI /4074k0reE7n+eIpS1P4+xU/gVz/AgAA//8DAFBLAQItABQABgAIAAAAIQDb4fbL7gAAAIUBAAAT AAAAAAAAAAAAAAAAAAAAAABbQ29udGVudF9UeXBlc10ueG1sUEsBAi0AFAAGAAgAAAAhAFr0LFu/ AAAAFQEAAAsAAAAAAAAAAAAAAAAAHwEAAF9yZWxzLy5yZWxzUEsBAi0AFAAGAAgAAAAhAAY36EfN AAAA5wAAAA8AAAAAAAAAAAAAAAAABwIAAGRycy9kb3ducmV2LnhtbFBLBQYAAAAAAwADALcAAAAB AwAAAAA= " fillcolor="white [3201]" stroked="f" strokeweight=".25pt">
                     <v:textbox>
                       <w:txbxContent>
                         <w:p>
@@ -2562,18 +2552,6 @@
                           <w:r>
                             <w:fldChar w:fldCharType="end"/>
                           </w:r>
-                          <w:r>
-                            <w:rPr>
-                              <w:rFonts w:ascii="Calibri" w:hAnsi="Calibri" w:cs="Calibri"/>
-                            </w:rPr>
-                            <w:t xml:space="preserve">  •  </w:t>
-                          </w:r>
-                          <w:r>
-                            <w:rPr>
-                              <w:rFonts w:ascii="Calibri" w:hAnsi="Calibri" w:cs="Calibri"/>
-                            </w:rPr>
-                            <w:t xml:space="preserve">In Redevelopment</w:t>
-                          </w:r>
                         </w:p>
                         <w:p>
                           <w:pPr>
@@ -2607,6 +2585,8 @@
                               <w:color w:val="A6A6A6" w:themeColor="background1" w:themeShade="A6"/>
                             </w:rPr>
                             <w:t xml:space="preserve">Google Certification Project, Nov 2020 - April 2021</w:t>
+                            <w:br/>
+                            <w:t xml:space="preserve">In Redevelopment</w:t>
                           </w:r>
                         </w:p>
                         <w:p>

</xml_diff>

<commit_message>
Point Portfolio link at bermux.dev
Co-Authored-By: Claude Fable 5 <noreply@anthropic.com>
Claude-Session: https://claude.ai/code/session_01APmxVZnXChYmuH8cBBMtxM
</commit_message>
<xml_diff>
--- a/resume/Ed Bermu — UX AI Product Designer Resume.docx
+++ b/resume/Ed Bermu — UX AI Product Designer Resume.docx
@@ -1316,7 +1316,7 @@
                                         <w:color w:val="0363C2"/>
                                       </w:rPr>
                                       <w:fldChar w:fldCharType="begin"/>
-                                      <w:instrText>HYPERLINK "https://www.bermux.com/"</w:instrText>
+                                      <w:instrText>HYPERLINK "https://www.bermux.dev"</w:instrText>
                                       <w:fldChar w:fldCharType="separate"/>
                                     </w:r>
                                     <w:r>
@@ -3154,7 +3154,7 @@
                                   <w:color w:val="0363C2"/>
                                 </w:rPr>
                                 <w:fldChar w:fldCharType="begin"/>
-                                <w:instrText>HYPERLINK "https://www.bermux.com/"</w:instrText>
+                                <w:instrText>HYPERLINK "https://www.bermux.dev"</w:instrText>
                                 <w:fldChar w:fldCharType="separate"/>
                               </w:r>
                               <w:r>

</xml_diff>

<commit_message>
Add Figma • Claude tech stack to Siobhan SS card
Co-Authored-By: Claude Fable 5 <noreply@anthropic.com>
Claude-Session: https://claude.ai/code/session_01APmxVZnXChYmuH8cBBMtxM
</commit_message>
<xml_diff>
--- a/resume/Ed Bermu — UX AI Product Designer Resume.docx
+++ b/resume/Ed Bermu — UX AI Product Designer Resume.docx
@@ -397,7 +397,7 @@
                                   <w:rPr>
                                     <w:rFonts w:ascii="Calibri" w:hAnsi="Calibri" w:cs="Calibri"/>
                                   </w:rPr>
-                                  <w:t xml:space="preserve">Client Commission</w:t>
+                                  <w:t xml:space="preserve">Figma • Claude</w:t>
                                 </w:r>
                                 <w:r>
                                   <w:rPr>
@@ -453,7 +453,7 @@
                                     <w:bCs/>
                                     <w:color w:val="A6A6A6" w:themeColor="background1" w:themeShade="A6"/>
                                   </w:rPr>
-                                  <w:t xml:space="preserve">2026</w:t>
+                                  <w:t xml:space="preserve">Client Commission, 2026</w:t>
                                 </w:r>
                               </w:p>
                               <w:p>
@@ -2380,7 +2380,7 @@
                             <w:rPr>
                               <w:rFonts w:ascii="Calibri" w:hAnsi="Calibri" w:cs="Calibri"/>
                             </w:rPr>
-                            <w:t xml:space="preserve">Client Commission</w:t>
+                            <w:t xml:space="preserve">Figma • Claude</w:t>
                           </w:r>
                           <w:r>
                             <w:rPr>
@@ -2436,7 +2436,7 @@
                               <w:bCs/>
                               <w:color w:val="A6A6A6" w:themeColor="background1" w:themeShade="A6"/>
                             </w:rPr>
-                            <w:t xml:space="preserve">2026</w:t>
+                            <w:t xml:space="preserve">Client Commission, 2026</w:t>
                           </w:r>
                         </w:p>
                         <w:p>

</xml_diff>

<commit_message>
Update SplitPay tech stack to Claude
Co-Authored-By: Claude Fable 5 <noreply@anthropic.com>
Claude-Session: https://claude.ai/code/session_01APmxVZnXChYmuH8cBBMtxM
</commit_message>
<xml_diff>
--- a/resume/Ed Bermu — UX AI Product Designer Resume.docx
+++ b/resume/Ed Bermu — UX AI Product Designer Resume.docx
@@ -741,7 +741,7 @@
                                   <w:rPr>
                                     <w:rFonts w:ascii="Calibri" w:hAnsi="Calibri" w:cs="Calibri"/>
                                   </w:rPr>
-                                  <w:t xml:space="preserve">Codex, Emergent.sh</w:t>
+                                  <w:t xml:space="preserve">Claude</w:t>
                                 </w:r>
                                 <w:r>
                                   <w:rPr>
@@ -2678,7 +2678,7 @@
                             <w:rPr>
                               <w:rFonts w:ascii="Calibri" w:hAnsi="Calibri" w:cs="Calibri"/>
                             </w:rPr>
-                            <w:t xml:space="preserve">Codex, Emergent.sh</w:t>
+                            <w:t xml:space="preserve">Claude</w:t>
                           </w:r>
                           <w:r>
                             <w:rPr>

</xml_diff>

<commit_message>
Align soft-skill bullets, add In Development/Redevelopment statuses
Normalized the soft-skills list to one bullet format, tightened the
right-column spacing so the full skills list fits, and added status
labels to the Strikeless, SplitPay, and Tree gray lines.

Co-Authored-By: Claude Fable 5 <noreply@anthropic.com>
Claude-Session: https://claude.ai/code/session_01APmxVZnXChYmuH8cBBMtxM
</commit_message>
<xml_diff>
--- a/resume/Ed Bermu — UX AI Product Designer Resume.docx
+++ b/resume/Ed Bermu — UX AI Product Designer Resume.docx
@@ -282,7 +282,7 @@
                                     <w:bCs/>
                                     <w:color w:val="A6A6A6" w:themeColor="background1" w:themeShade="A6"/>
                                   </w:rPr>
-                                  <w:t xml:space="preserve">Feb 2026 - Present</w:t>
+                                  <w:t xml:space="preserve">Feb 2026 - Present | In Development</w:t>
                                 </w:r>
                               </w:p>
                               <w:p>
@@ -626,7 +626,7 @@
                                   </w:rPr>
                                   <w:t xml:space="preserve">Google Certification Project, Nov 2020 - April 2021</w:t>
                                   <w:br/>
-                                  <w:t xml:space="preserve">In Redevelopment</w:t>
+                                  <w:t xml:space="preserve">| In Redevelopment</w:t>
                                 </w:r>
                               </w:p>
                               <w:p>
@@ -797,7 +797,7 @@
                                     <w:bCs/>
                                     <w:color w:val="A6A6A6" w:themeColor="background1" w:themeShade="A6"/>
                                   </w:rPr>
-                                  <w:t xml:space="preserve">Dec 2025 – Present</w:t>
+                                  <w:t xml:space="preserve">Dec 2025 – Present | In Development</w:t>
                                 </w:r>
                               </w:p>
                               <w:p>
@@ -1246,8 +1246,8 @@
                         <wps:cNvSpPr txBox="1"/>
                         <wps:spPr>
                           <a:xfrm>
-                            <a:off x="4601172" y="1239433"/>
-                            <a:ext cx="2985669" cy="8611073"/>
+                            <a:off x="4601172" y="1100000"/>
+                            <a:ext cx="2985669" cy="8750506"/>
                           </a:xfrm>
                           <a:prstGeom prst="rect">
                             <a:avLst/>
@@ -1387,7 +1387,7 @@
                                   </w:p>
                                   <w:p>
                                     <w:pPr>
-                                      <w:spacing w:line="276" w:lineRule="auto"/>
+                                      <w:spacing w:line="240" w:lineRule="auto"/>
                                       <w:rPr>
                                         <w:rFonts w:ascii="Calibri" w:hAnsi="Calibri" w:cs="Calibri"/>
                                       </w:rPr>
@@ -1412,7 +1412,7 @@
                                   </w:p>
                                   <w:p>
                                     <w:pPr>
-                                      <w:spacing w:line="276" w:lineRule="auto"/>
+                                      <w:spacing w:line="240" w:lineRule="auto"/>
                                       <w:rPr>
                                         <w:rFonts w:ascii="Calibri" w:hAnsi="Calibri" w:cs="Calibri"/>
                                         <w:color w:val="auto"/>
@@ -1575,7 +1575,7 @@
                                   <w:p>
                                     <w:pPr>
                                       <w:pStyle w:val="ListBullet"/>
-                                      <w:spacing w:line="276" w:lineRule="auto"/>
+                                      <w:spacing w:line="240" w:lineRule="auto"/>
                                       <w:rPr>
                                         <w:rFonts w:ascii="Calibri" w:hAnsi="Calibri" w:cs="Calibri"/>
                                       </w:rPr>
@@ -1590,7 +1590,7 @@
                                   <w:p>
                                     <w:pPr>
                                       <w:pStyle w:val="ListBullet"/>
-                                      <w:spacing w:line="276" w:lineRule="auto"/>
+                                      <w:spacing w:line="240" w:lineRule="auto"/>
                                       <w:rPr>
                                         <w:rFonts w:ascii="Calibri" w:hAnsi="Calibri" w:cs="Calibri"/>
                                       </w:rPr>
@@ -1605,7 +1605,7 @@
                                   <w:p>
                                     <w:pPr>
                                       <w:pStyle w:val="ListBullet"/>
-                                      <w:spacing w:line="276" w:lineRule="auto"/>
+                                      <w:spacing w:line="240" w:lineRule="auto"/>
                                       <w:rPr>
                                         <w:rFonts w:ascii="Calibri" w:hAnsi="Calibri" w:cs="Calibri"/>
                                       </w:rPr>
@@ -1620,7 +1620,7 @@
                                   <w:p>
                                     <w:pPr>
                                       <w:pStyle w:val="ListBullet"/>
-                                      <w:spacing w:line="276" w:lineRule="auto"/>
+                                      <w:spacing w:line="240" w:lineRule="auto"/>
                                       <w:rPr>
                                         <w:rFonts w:ascii="Calibri" w:hAnsi="Calibri" w:cs="Calibri"/>
                                       </w:rPr>
@@ -1635,7 +1635,7 @@
                                   <w:p>
                                     <w:pPr>
                                       <w:pStyle w:val="ListBullet"/>
-                                      <w:spacing w:line="276" w:lineRule="auto"/>
+                                      <w:spacing w:line="240" w:lineRule="auto"/>
                                       <w:rPr>
                                         <w:rFonts w:ascii="Calibri" w:hAnsi="Calibri" w:cs="Calibri"/>
                                       </w:rPr>
@@ -1650,7 +1650,7 @@
                                   <w:p>
                                     <w:pPr>
                                       <w:pStyle w:val="ListBullet"/>
-                                      <w:spacing w:line="276" w:lineRule="auto"/>
+                                      <w:spacing w:line="240" w:lineRule="auto"/>
                                       <w:rPr>
                                         <w:rFonts w:ascii="Calibri" w:hAnsi="Calibri" w:cs="Calibri"/>
                                       </w:rPr>
@@ -1665,7 +1665,7 @@
                                   <w:p>
                                     <w:pPr>
                                       <w:pStyle w:val="ListBullet"/>
-                                      <w:spacing w:line="276" w:lineRule="auto"/>
+                                      <w:spacing w:line="240" w:lineRule="auto"/>
                                       <w:rPr>
                                         <w:rFonts w:ascii="Calibri" w:hAnsi="Calibri" w:cs="Calibri"/>
                                       </w:rPr>
@@ -1699,7 +1699,7 @@
                                   <w:p>
                                     <w:pPr>
                                       <w:pStyle w:val="ListBullet"/>
-                                      <w:spacing w:line="276" w:lineRule="auto"/>
+                                      <w:spacing w:line="240" w:lineRule="auto"/>
                                       <w:rPr>
                                         <w:rFonts w:ascii="Calibri" w:hAnsi="Calibri" w:cs="Calibri"/>
                                       </w:rPr>
@@ -1710,20 +1710,6 @@
                                       </w:rPr>
                                       <w:t xml:space="preserve">Platform Builder—Webflow, Wix, Squarespace</w:t>
                                     </w:r>
-                                  </w:p>
-                                  <w:p>
-                                    <w:pPr>
-                                      <w:pStyle w:val="ListBullet"/>
-                                      <w:numPr>
-                                        <w:ilvl w:val="0"/>
-                                        <w:numId w:val="0"/>
-                                      </w:numPr>
-                                      <w:spacing w:line="276" w:lineRule="auto"/>
-                                      <w:ind w:left="360" w:hanging="360"/>
-                                      <w:rPr>
-                                        <w:rFonts w:ascii="Calibri" w:hAnsi="Calibri" w:cs="Calibri"/>
-                                      </w:rPr>
-                                    </w:pPr>
                                   </w:p>
                                   <w:p>
                                     <w:pPr>
@@ -1748,12 +1734,12 @@
                                       <w:pStyle w:val="ListParagraph"/>
                                       <w:numPr>
                                         <w:ilvl w:val="0"/>
-                                        <w:numId w:val="16"/>
+                                        <w:numId w:val="15"/>
                                       </w:numPr>
                                       <w:tabs>
-                                        <w:tab w:val="left" w:pos="90"/>
+                                        <w:tab w:val="left" w:pos="630"/>
                                       </w:tabs>
-                                      <w:spacing w:line="276" w:lineRule="auto"/>
+                                      <w:spacing w:line="240" w:lineRule="auto"/>
                                       <w:ind w:left="360"/>
                                       <w:rPr>
                                         <w:rFonts w:ascii="Calibri" w:hAnsi="Calibri" w:cs="Calibri"/>
@@ -1771,12 +1757,12 @@
                                       <w:pStyle w:val="ListParagraph"/>
                                       <w:numPr>
                                         <w:ilvl w:val="0"/>
-                                        <w:numId w:val="16"/>
+                                        <w:numId w:val="15"/>
                                       </w:numPr>
                                       <w:tabs>
-                                        <w:tab w:val="left" w:pos="90"/>
+                                        <w:tab w:val="left" w:pos="630"/>
                                       </w:tabs>
-                                      <w:spacing w:line="276" w:lineRule="auto"/>
+                                      <w:spacing w:line="240" w:lineRule="auto"/>
                                       <w:ind w:left="360"/>
                                       <w:rPr>
                                         <w:rFonts w:ascii="Calibri" w:hAnsi="Calibri" w:cs="Calibri"/>
@@ -1794,12 +1780,12 @@
                                       <w:pStyle w:val="ListParagraph"/>
                                       <w:numPr>
                                         <w:ilvl w:val="0"/>
-                                        <w:numId w:val="16"/>
+                                        <w:numId w:val="15"/>
                                       </w:numPr>
                                       <w:tabs>
-                                        <w:tab w:val="left" w:pos="90"/>
+                                        <w:tab w:val="left" w:pos="630"/>
                                       </w:tabs>
-                                      <w:spacing w:line="276" w:lineRule="auto"/>
+                                      <w:spacing w:line="240" w:lineRule="auto"/>
                                       <w:ind w:left="360"/>
                                       <w:rPr>
                                         <w:rFonts w:ascii="Calibri" w:hAnsi="Calibri" w:cs="Calibri"/>
@@ -1817,12 +1803,12 @@
                                       <w:pStyle w:val="ListParagraph"/>
                                       <w:numPr>
                                         <w:ilvl w:val="0"/>
-                                        <w:numId w:val="16"/>
+                                        <w:numId w:val="15"/>
                                       </w:numPr>
                                       <w:tabs>
-                                        <w:tab w:val="left" w:pos="90"/>
+                                        <w:tab w:val="left" w:pos="630"/>
                                       </w:tabs>
-                                      <w:spacing w:line="276" w:lineRule="auto"/>
+                                      <w:spacing w:line="240" w:lineRule="auto"/>
                                       <w:ind w:left="360"/>
                                       <w:rPr>
                                         <w:rFonts w:ascii="Calibri" w:hAnsi="Calibri" w:cs="Calibri"/>
@@ -1840,12 +1826,12 @@
                                       <w:pStyle w:val="ListParagraph"/>
                                       <w:numPr>
                                         <w:ilvl w:val="0"/>
-                                        <w:numId w:val="16"/>
+                                        <w:numId w:val="15"/>
                                       </w:numPr>
                                       <w:tabs>
-                                        <w:tab w:val="left" w:pos="90"/>
+                                        <w:tab w:val="left" w:pos="630"/>
                                       </w:tabs>
-                                      <w:spacing w:line="276" w:lineRule="auto"/>
+                                      <w:spacing w:line="240" w:lineRule="auto"/>
                                       <w:ind w:left="360"/>
                                       <w:rPr>
                                         <w:rFonts w:ascii="Calibri" w:hAnsi="Calibri" w:cs="Calibri"/>
@@ -1868,7 +1854,7 @@
                                       <w:tabs>
                                         <w:tab w:val="left" w:pos="630"/>
                                       </w:tabs>
-                                      <w:spacing w:line="276" w:lineRule="auto"/>
+                                      <w:spacing w:line="240" w:lineRule="auto"/>
                                       <w:ind w:left="360"/>
                                       <w:rPr>
                                         <w:rFonts w:ascii="Calibri" w:hAnsi="Calibri" w:cs="Calibri"/>
@@ -1891,7 +1877,7 @@
                                       <w:tabs>
                                         <w:tab w:val="left" w:pos="630"/>
                                       </w:tabs>
-                                      <w:spacing w:line="276" w:lineRule="auto"/>
+                                      <w:spacing w:line="240" w:lineRule="auto"/>
                                       <w:ind w:left="360"/>
                                       <w:rPr>
                                         <w:rFonts w:ascii="Calibri" w:hAnsi="Calibri" w:cs="Calibri"/>
@@ -1914,7 +1900,7 @@
                                       <w:tabs>
                                         <w:tab w:val="left" w:pos="630"/>
                                       </w:tabs>
-                                      <w:spacing w:line="276" w:lineRule="auto"/>
+                                      <w:spacing w:line="240" w:lineRule="auto"/>
                                       <w:ind w:left="360"/>
                                       <w:rPr>
                                         <w:rFonts w:ascii="Calibri" w:hAnsi="Calibri" w:cs="Calibri"/>
@@ -1937,7 +1923,7 @@
                                       <w:tabs>
                                         <w:tab w:val="left" w:pos="630"/>
                                       </w:tabs>
-                                      <w:spacing w:line="276" w:lineRule="auto"/>
+                                      <w:spacing w:line="240" w:lineRule="auto"/>
                                       <w:ind w:left="360"/>
                                       <w:rPr>
                                         <w:rFonts w:ascii="Calibri" w:hAnsi="Calibri" w:cs="Calibri"/>
@@ -1960,7 +1946,7 @@
                                       <w:tabs>
                                         <w:tab w:val="left" w:pos="630"/>
                                       </w:tabs>
-                                      <w:spacing w:line="276" w:lineRule="auto"/>
+                                      <w:spacing w:line="240" w:lineRule="auto"/>
                                       <w:ind w:left="360"/>
                                       <w:rPr>
                                         <w:rFonts w:ascii="Calibri" w:hAnsi="Calibri" w:cs="Calibri"/>
@@ -1980,7 +1966,7 @@
                                         <w:ilvl w:val="0"/>
                                         <w:numId w:val="15"/>
                                       </w:numPr>
-                                      <w:spacing w:line="276" w:lineRule="auto"/>
+                                      <w:spacing w:line="240" w:lineRule="auto"/>
                                       <w:ind w:left="360"/>
                                       <w:rPr>
                                         <w:rFonts w:ascii="Calibri" w:hAnsi="Calibri" w:cs="Calibri"/>
@@ -2000,7 +1986,7 @@
                                         <w:ilvl w:val="0"/>
                                         <w:numId w:val="0"/>
                                       </w:numPr>
-                                      <w:spacing w:line="276" w:lineRule="auto"/>
+                                      <w:spacing w:line="240" w:lineRule="auto"/>
                                       <w:ind w:left="360" w:hanging="360"/>
                                       <w:rPr>
                                         <w:rFonts w:ascii="Calibri" w:hAnsi="Calibri" w:cs="Calibri"/>
@@ -2077,7 +2063,7 @@
                                   <w:ilvl w:val="0"/>
                                   <w:numId w:val="0"/>
                                 </w:numPr>
-                                <w:spacing w:line="276" w:lineRule="auto"/>
+                                <w:spacing w:line="240" w:lineRule="auto"/>
                                 <w:rPr>
                                   <w:rFonts w:ascii="Calibri" w:hAnsi="Calibri" w:cs="Calibri"/>
                                 </w:rPr>
@@ -2288,7 +2274,7 @@
                               <w:bCs/>
                               <w:color w:val="A6A6A6" w:themeColor="background1" w:themeShade="A6"/>
                             </w:rPr>
-                            <w:t xml:space="preserve">Feb 2026 - Present</w:t>
+                            <w:t xml:space="preserve">Feb 2026 - Present | In Development</w:t>
                           </w:r>
                         </w:p>
                         <w:p>
@@ -2586,7 +2572,7 @@
                             </w:rPr>
                             <w:t xml:space="preserve">Google Certification Project, Nov 2020 - April 2021</w:t>
                             <w:br/>
-                            <w:t xml:space="preserve">In Redevelopment</w:t>
+                            <w:t xml:space="preserve">| In Redevelopment</w:t>
                           </w:r>
                         </w:p>
                         <w:p>
@@ -2734,7 +2720,7 @@
                               <w:bCs/>
                               <w:color w:val="A6A6A6" w:themeColor="background1" w:themeShade="A6"/>
                             </w:rPr>
-                            <w:t xml:space="preserve">Dec 2025 – Present</w:t>
+                            <w:t xml:space="preserve">Dec 2025 – Present | In Development</w:t>
                           </w:r>
                         </w:p>
                         <w:p>
@@ -3096,7 +3082,7 @@
                     </v:textbox>
                   </v:shape>
                 </v:group>
-                <v:shape id="Text Box 14" o:spid="_x0000_s1037" type="#_x0000_t202" style="position:absolute;left:46011;top:12394;width:29857;height:86111;visibility:visible;mso-wrap-style:square;v-text-anchor:top" o:gfxdata="UEsDBBQABgAIAAAAIQDb4fbL7gAAAIUBAAATAAAAW0NvbnRlbnRfVHlwZXNdLnhtbHyQz07DMAyH 70i8Q+QralM4IITa7kDhCAiNB7ASt43WOlEcyvb2pNu4IODoPz9/n1xv9vOkForiPDdwXVagiI23 jocG3rdPxR0oScgWJ8/UwIEENu3lRb09BBKV0ywNjCmFe63FjDSjlD4Q50nv44wpl3HQAc0OB9I3 VXWrjedEnIq03oC27qjHjympx31un0wiTQLq4bS4shrAECZnMGVTvbD9QSnOhDInjzsyuiBXWQP0 r4R18jfgnHvJr4nOknrFmJ5xzhraRtHWf3Kkpfz/yGo5S+H73hkquyhdjr3R8m2lj09svwAAAP// AwBQSwMEFAAGAAgAAAAhAFr0LFu/AAAAFQEAAAsAAABfcmVscy8ucmVsc2zPwWrDMAwG4Ptg72B0 X5TuUMaI01uh19I+gLGVxCy2jGSy9e1nemrHjpL4P0nD4SetZiPRyNnCruvBUPYcYp4tXC/Htw8w Wl0ObuVMFm6kcBhfX4Yzra62kC6xqGlKVgtLreUTUf1CyWnHhXKbTCzJ1VbKjMX5LzcTvvf9HuXR gPHJNKdgQU5hB+ZyK23zHztFL6w81c5zQp6m6P9TMfB3PtPWFCczVQtB9N4U2rp2HOA44NMz4y8A AAD//wMAUEsDBBQABgAIAAAAIQDXSJtp0AAAAOcAAAAPAAAAZHJzL2Rvd25yZXYueG1sRI9BS8NA FITvgv9heUIvYjfatClpt0XUttJbG7X09sg+k2D2bciuSfrvXUHwMjAM8w2zXA+mFh21rrKs4H4c gSDOra64UPCWbe7mIJxH1lhbJgUXcrBeXV8tMdW25wN1R1+IAGGXooLS+yaV0uUlGXRj2xCH7NO2 Bn2wbSF1i32Am1o+RNFMGqw4LJTY0FNJ+dfx2yg43xanvRu27/1kOmledl2WfOhMqdHN8LwI8rgA 4Wnw/40/xKtWkCRxPI9n0xh+f4VPIFc/AAAA//8DAFBLAQItABQABgAIAAAAIQDb4fbL7gAAAIUB AAATAAAAAAAAAAAAAAAAAAAAAABbQ29udGVudF9UeXBlc10ueG1sUEsBAi0AFAAGAAgAAAAhAFr0 LFu/AAAAFQEAAAsAAAAAAAAAAAAAAAAAHwEAAF9yZWxzLy5yZWxzUEsBAi0AFAAGAAgAAAAhANdI m2nQAAAA5wAAAA8AAAAAAAAAAAAAAAAABwIAAGRycy9kb3ducmV2LnhtbFBLBQYAAAAAAwADALcA AAAEAwAAAAA= " fillcolor="white [3201]" stroked="f" strokeweight=".5pt">
+                <v:shape id="Text Box 14" o:spid="_x0000_s1037" type="#_x0000_t202" style="position:absolute;left:46011;top:11000;width:29857;height:87505;visibility:visible;mso-wrap-style:square;v-text-anchor:top" o:gfxdata="UEsDBBQABgAIAAAAIQDb4fbL7gAAAIUBAAATAAAAW0NvbnRlbnRfVHlwZXNdLnhtbHyQz07DMAyH 70i8Q+QralM4IITa7kDhCAiNB7ASt43WOlEcyvb2pNu4IODoPz9/n1xv9vOkForiPDdwXVagiI23 jocG3rdPxR0oScgWJ8/UwIEENu3lRb09BBKV0ywNjCmFe63FjDSjlD4Q50nv44wpl3HQAc0OB9I3 VXWrjedEnIq03oC27qjHjympx31un0wiTQLq4bS4shrAECZnMGVTvbD9QSnOhDInjzsyuiBXWQP0 r4R18jfgnHvJr4nOknrFmJ5xzhraRtHWf3Kkpfz/yGo5S+H73hkquyhdjr3R8m2lj09svwAAAP// AwBQSwMEFAAGAAgAAAAhAFr0LFu/AAAAFQEAAAsAAABfcmVscy8ucmVsc2zPwWrDMAwG4Ptg72B0 X5TuUMaI01uh19I+gLGVxCy2jGSy9e1nemrHjpL4P0nD4SetZiPRyNnCruvBUPYcYp4tXC/Htw8w Wl0ObuVMFm6kcBhfX4Yzra62kC6xqGlKVgtLreUTUf1CyWnHhXKbTCzJ1VbKjMX5LzcTvvf9HuXR gPHJNKdgQU5hB+ZyK23zHztFL6w81c5zQp6m6P9TMfB3PtPWFCczVQtB9N4U2rp2HOA44NMz4y8A AAD//wMAUEsDBBQABgAIAAAAIQDXSJtp0AAAAOcAAAAPAAAAZHJzL2Rvd25yZXYueG1sRI9BS8NA FITvgv9heUIvYjfatClpt0XUttJbG7X09sg+k2D2bciuSfrvXUHwMjAM8w2zXA+mFh21rrKs4H4c gSDOra64UPCWbe7mIJxH1lhbJgUXcrBeXV8tMdW25wN1R1+IAGGXooLS+yaV0uUlGXRj2xCH7NO2 Bn2wbSF1i32Am1o+RNFMGqw4LJTY0FNJ+dfx2yg43xanvRu27/1kOmledl2WfOhMqdHN8LwI8rgA 4Wnw/40/xKtWkCRxPI9n0xh+f4VPIFc/AAAA//8DAFBLAQItABQABgAIAAAAIQDb4fbL7gAAAIUB AAATAAAAAAAAAAAAAAAAAAAAAABbQ29udGVudF9UeXBlc10ueG1sUEsBAi0AFAAGAAgAAAAhAFr0 LFu/AAAAFQEAAAsAAAAAAAAAAAAAAAAAHwEAAF9yZWxzLy5yZWxzUEsBAi0AFAAGAAgAAAAhANdI m2nQAAAA5wAAAA8AAAAAAAAAAAAAAAAABwIAAGRycy9kb3ducmV2LnhtbFBLBQYAAAAAAwADALcA AAAEAwAAAAA= " fillcolor="white [3201]" stroked="f" strokeweight=".5pt">
                   <v:textbox>
                     <w:txbxContent>
                       <w:p>
@@ -3225,7 +3211,7 @@
                             </w:p>
                             <w:p>
                               <w:pPr>
-                                <w:spacing w:line="276" w:lineRule="auto"/>
+                                <w:spacing w:line="240" w:lineRule="auto"/>
                                 <w:rPr>
                                   <w:rFonts w:ascii="Calibri" w:hAnsi="Calibri" w:cs="Calibri"/>
                                 </w:rPr>
@@ -3250,7 +3236,7 @@
                             </w:p>
                             <w:p>
                               <w:pPr>
-                                <w:spacing w:line="276" w:lineRule="auto"/>
+                                <w:spacing w:line="240" w:lineRule="auto"/>
                                 <w:rPr>
                                   <w:rFonts w:ascii="Calibri" w:hAnsi="Calibri" w:cs="Calibri"/>
                                   <w:color w:val="auto"/>
@@ -3413,7 +3399,7 @@
                             <w:p>
                               <w:pPr>
                                 <w:pStyle w:val="ListBullet"/>
-                                <w:spacing w:line="276" w:lineRule="auto"/>
+                                <w:spacing w:line="240" w:lineRule="auto"/>
                                 <w:rPr>
                                   <w:rFonts w:ascii="Calibri" w:hAnsi="Calibri" w:cs="Calibri"/>
                                 </w:rPr>
@@ -3428,7 +3414,7 @@
                             <w:p>
                               <w:pPr>
                                 <w:pStyle w:val="ListBullet"/>
-                                <w:spacing w:line="276" w:lineRule="auto"/>
+                                <w:spacing w:line="240" w:lineRule="auto"/>
                                 <w:rPr>
                                   <w:rFonts w:ascii="Calibri" w:hAnsi="Calibri" w:cs="Calibri"/>
                                 </w:rPr>
@@ -3443,7 +3429,7 @@
                             <w:p>
                               <w:pPr>
                                 <w:pStyle w:val="ListBullet"/>
-                                <w:spacing w:line="276" w:lineRule="auto"/>
+                                <w:spacing w:line="240" w:lineRule="auto"/>
                                 <w:rPr>
                                   <w:rFonts w:ascii="Calibri" w:hAnsi="Calibri" w:cs="Calibri"/>
                                 </w:rPr>
@@ -3458,7 +3444,7 @@
                             <w:p>
                               <w:pPr>
                                 <w:pStyle w:val="ListBullet"/>
-                                <w:spacing w:line="276" w:lineRule="auto"/>
+                                <w:spacing w:line="240" w:lineRule="auto"/>
                                 <w:rPr>
                                   <w:rFonts w:ascii="Calibri" w:hAnsi="Calibri" w:cs="Calibri"/>
                                 </w:rPr>
@@ -3473,7 +3459,7 @@
                             <w:p>
                               <w:pPr>
                                 <w:pStyle w:val="ListBullet"/>
-                                <w:spacing w:line="276" w:lineRule="auto"/>
+                                <w:spacing w:line="240" w:lineRule="auto"/>
                                 <w:rPr>
                                   <w:rFonts w:ascii="Calibri" w:hAnsi="Calibri" w:cs="Calibri"/>
                                 </w:rPr>
@@ -3488,7 +3474,7 @@
                             <w:p>
                               <w:pPr>
                                 <w:pStyle w:val="ListBullet"/>
-                                <w:spacing w:line="276" w:lineRule="auto"/>
+                                <w:spacing w:line="240" w:lineRule="auto"/>
                                 <w:rPr>
                                   <w:rFonts w:ascii="Calibri" w:hAnsi="Calibri" w:cs="Calibri"/>
                                 </w:rPr>
@@ -3503,7 +3489,7 @@
                             <w:p>
                               <w:pPr>
                                 <w:pStyle w:val="ListBullet"/>
-                                <w:spacing w:line="276" w:lineRule="auto"/>
+                                <w:spacing w:line="240" w:lineRule="auto"/>
                                 <w:rPr>
                                   <w:rFonts w:ascii="Calibri" w:hAnsi="Calibri" w:cs="Calibri"/>
                                 </w:rPr>
@@ -3537,7 +3523,7 @@
                             <w:p>
                               <w:pPr>
                                 <w:pStyle w:val="ListBullet"/>
-                                <w:spacing w:line="276" w:lineRule="auto"/>
+                                <w:spacing w:line="240" w:lineRule="auto"/>
                                 <w:rPr>
                                   <w:rFonts w:ascii="Calibri" w:hAnsi="Calibri" w:cs="Calibri"/>
                                 </w:rPr>
@@ -3548,20 +3534,6 @@
                                 </w:rPr>
                                 <w:t xml:space="preserve">Platform Builder—Webflow, Wix, Squarespace</w:t>
                               </w:r>
-                            </w:p>
-                            <w:p>
-                              <w:pPr>
-                                <w:pStyle w:val="ListBullet"/>
-                                <w:numPr>
-                                  <w:ilvl w:val="0"/>
-                                  <w:numId w:val="0"/>
-                                </w:numPr>
-                                <w:spacing w:line="276" w:lineRule="auto"/>
-                                <w:ind w:left="360" w:hanging="360"/>
-                                <w:rPr>
-                                  <w:rFonts w:ascii="Calibri" w:hAnsi="Calibri" w:cs="Calibri"/>
-                                </w:rPr>
-                              </w:pPr>
                             </w:p>
                             <w:p>
                               <w:pPr>
@@ -3586,12 +3558,12 @@
                                 <w:pStyle w:val="ListParagraph"/>
                                 <w:numPr>
                                   <w:ilvl w:val="0"/>
-                                  <w:numId w:val="16"/>
+                                  <w:numId w:val="15"/>
                                 </w:numPr>
                                 <w:tabs>
-                                  <w:tab w:val="left" w:pos="90"/>
+                                  <w:tab w:val="left" w:pos="630"/>
                                 </w:tabs>
-                                <w:spacing w:line="276" w:lineRule="auto"/>
+                                <w:spacing w:line="240" w:lineRule="auto"/>
                                 <w:ind w:left="360"/>
                                 <w:rPr>
                                   <w:rFonts w:ascii="Calibri" w:hAnsi="Calibri" w:cs="Calibri"/>
@@ -3609,12 +3581,12 @@
                                 <w:pStyle w:val="ListParagraph"/>
                                 <w:numPr>
                                   <w:ilvl w:val="0"/>
-                                  <w:numId w:val="16"/>
+                                  <w:numId w:val="15"/>
                                 </w:numPr>
                                 <w:tabs>
-                                  <w:tab w:val="left" w:pos="90"/>
+                                  <w:tab w:val="left" w:pos="630"/>
                                 </w:tabs>
-                                <w:spacing w:line="276" w:lineRule="auto"/>
+                                <w:spacing w:line="240" w:lineRule="auto"/>
                                 <w:ind w:left="360"/>
                                 <w:rPr>
                                   <w:rFonts w:ascii="Calibri" w:hAnsi="Calibri" w:cs="Calibri"/>
@@ -3632,12 +3604,12 @@
                                 <w:pStyle w:val="ListParagraph"/>
                                 <w:numPr>
                                   <w:ilvl w:val="0"/>
-                                  <w:numId w:val="16"/>
+                                  <w:numId w:val="15"/>
                                 </w:numPr>
                                 <w:tabs>
-                                  <w:tab w:val="left" w:pos="90"/>
+                                  <w:tab w:val="left" w:pos="630"/>
                                 </w:tabs>
-                                <w:spacing w:line="276" w:lineRule="auto"/>
+                                <w:spacing w:line="240" w:lineRule="auto"/>
                                 <w:ind w:left="360"/>
                                 <w:rPr>
                                   <w:rFonts w:ascii="Calibri" w:hAnsi="Calibri" w:cs="Calibri"/>
@@ -3655,12 +3627,12 @@
                                 <w:pStyle w:val="ListParagraph"/>
                                 <w:numPr>
                                   <w:ilvl w:val="0"/>
-                                  <w:numId w:val="16"/>
+                                  <w:numId w:val="15"/>
                                 </w:numPr>
                                 <w:tabs>
-                                  <w:tab w:val="left" w:pos="90"/>
+                                  <w:tab w:val="left" w:pos="630"/>
                                 </w:tabs>
-                                <w:spacing w:line="276" w:lineRule="auto"/>
+                                <w:spacing w:line="240" w:lineRule="auto"/>
                                 <w:ind w:left="360"/>
                                 <w:rPr>
                                   <w:rFonts w:ascii="Calibri" w:hAnsi="Calibri" w:cs="Calibri"/>
@@ -3678,12 +3650,12 @@
                                 <w:pStyle w:val="ListParagraph"/>
                                 <w:numPr>
                                   <w:ilvl w:val="0"/>
-                                  <w:numId w:val="16"/>
+                                  <w:numId w:val="15"/>
                                 </w:numPr>
                                 <w:tabs>
-                                  <w:tab w:val="left" w:pos="90"/>
+                                  <w:tab w:val="left" w:pos="630"/>
                                 </w:tabs>
-                                <w:spacing w:line="276" w:lineRule="auto"/>
+                                <w:spacing w:line="240" w:lineRule="auto"/>
                                 <w:ind w:left="360"/>
                                 <w:rPr>
                                   <w:rFonts w:ascii="Calibri" w:hAnsi="Calibri" w:cs="Calibri"/>
@@ -3706,7 +3678,7 @@
                                 <w:tabs>
                                   <w:tab w:val="left" w:pos="630"/>
                                 </w:tabs>
-                                <w:spacing w:line="276" w:lineRule="auto"/>
+                                <w:spacing w:line="240" w:lineRule="auto"/>
                                 <w:ind w:left="360"/>
                                 <w:rPr>
                                   <w:rFonts w:ascii="Calibri" w:hAnsi="Calibri" w:cs="Calibri"/>
@@ -3729,7 +3701,7 @@
                                 <w:tabs>
                                   <w:tab w:val="left" w:pos="630"/>
                                 </w:tabs>
-                                <w:spacing w:line="276" w:lineRule="auto"/>
+                                <w:spacing w:line="240" w:lineRule="auto"/>
                                 <w:ind w:left="360"/>
                                 <w:rPr>
                                   <w:rFonts w:ascii="Calibri" w:hAnsi="Calibri" w:cs="Calibri"/>
@@ -3752,7 +3724,7 @@
                                 <w:tabs>
                                   <w:tab w:val="left" w:pos="630"/>
                                 </w:tabs>
-                                <w:spacing w:line="276" w:lineRule="auto"/>
+                                <w:spacing w:line="240" w:lineRule="auto"/>
                                 <w:ind w:left="360"/>
                                 <w:rPr>
                                   <w:rFonts w:ascii="Calibri" w:hAnsi="Calibri" w:cs="Calibri"/>
@@ -3775,7 +3747,7 @@
                                 <w:tabs>
                                   <w:tab w:val="left" w:pos="630"/>
                                 </w:tabs>
-                                <w:spacing w:line="276" w:lineRule="auto"/>
+                                <w:spacing w:line="240" w:lineRule="auto"/>
                                 <w:ind w:left="360"/>
                                 <w:rPr>
                                   <w:rFonts w:ascii="Calibri" w:hAnsi="Calibri" w:cs="Calibri"/>
@@ -3798,7 +3770,7 @@
                                 <w:tabs>
                                   <w:tab w:val="left" w:pos="630"/>
                                 </w:tabs>
-                                <w:spacing w:line="276" w:lineRule="auto"/>
+                                <w:spacing w:line="240" w:lineRule="auto"/>
                                 <w:ind w:left="360"/>
                                 <w:rPr>
                                   <w:rFonts w:ascii="Calibri" w:hAnsi="Calibri" w:cs="Calibri"/>
@@ -3818,7 +3790,7 @@
                                   <w:ilvl w:val="0"/>
                                   <w:numId w:val="15"/>
                                 </w:numPr>
-                                <w:spacing w:line="276" w:lineRule="auto"/>
+                                <w:spacing w:line="240" w:lineRule="auto"/>
                                 <w:ind w:left="360"/>
                                 <w:rPr>
                                   <w:rFonts w:ascii="Calibri" w:hAnsi="Calibri" w:cs="Calibri"/>
@@ -3838,7 +3810,7 @@
                                   <w:ilvl w:val="0"/>
                                   <w:numId w:val="0"/>
                                 </w:numPr>
-                                <w:spacing w:line="276" w:lineRule="auto"/>
+                                <w:spacing w:line="240" w:lineRule="auto"/>
                                 <w:ind w:left="360" w:hanging="360"/>
                                 <w:rPr>
                                   <w:rFonts w:ascii="Calibri" w:hAnsi="Calibri" w:cs="Calibri"/>
@@ -3915,7 +3887,7 @@
                             <w:ilvl w:val="0"/>
                             <w:numId w:val="0"/>
                           </w:numPr>
-                          <w:spacing w:line="276" w:lineRule="auto"/>
+                          <w:spacing w:line="240" w:lineRule="auto"/>
                           <w:rPr>
                             <w:rFonts w:ascii="Calibri" w:hAnsi="Calibri" w:cs="Calibri"/>
                           </w:rPr>

</xml_diff>